<commit_message>
Update conventional youtube docx
</commit_message>
<xml_diff>
--- a/TranscriptAnalysis/results_youtube/correlation_conventional/-AKD2Lv7XqI/-AKD2Lv7XqI_correlation_topics_n0_p15_m6.docx
+++ b/TranscriptAnalysis/results_youtube/correlation_conventional/-AKD2Lv7XqI/-AKD2Lv7XqI_correlation_topics_n0_p15_m6.docx
@@ -221,6 +221,15 @@
           <w:b/>
         </w:rPr>
         <w:t>Score &gt;= 60: 33 (31.7%)</w:t>
+      </w:r>
+      <w:r>
+        <w:br/>
+      </w:r>
+      <w:r>
+        <w:rPr>
+          <w:b/>
+        </w:rPr>
+        <w:t>Average Score (of valid matches): 82.73</w:t>
       </w:r>
     </w:p>
     <w:p>
@@ -628,6 +637,15 @@
         </w:rPr>
         <w:t>Score &gt;= 60: 30 (28.8%)</w:t>
       </w:r>
+      <w:r>
+        <w:br/>
+      </w:r>
+      <w:r>
+        <w:rPr>
+          <w:b/>
+        </w:rPr>
+        <w:t>Average Score (of valid matches): 81.83</w:t>
+      </w:r>
     </w:p>
     <w:p>
       <w:pPr>
@@ -1030,6 +1048,15 @@
           <w:b/>
         </w:rPr>
         <w:t>Score &gt;= 60: 18 (17.3%)</w:t>
+      </w:r>
+      <w:r>
+        <w:br/>
+      </w:r>
+      <w:r>
+        <w:rPr>
+          <w:b/>
+        </w:rPr>
+        <w:t>Average Score (of valid matches): 80.56</w:t>
       </w:r>
     </w:p>
     <w:p>
@@ -1453,6 +1480,15 @@
         </w:rPr>
         <w:t>Score &gt;= 60: 22 (21.2%)</w:t>
       </w:r>
+      <w:r>
+        <w:br/>
+      </w:r>
+      <w:r>
+        <w:rPr>
+          <w:b/>
+        </w:rPr>
+        <w:t>Average Score (of valid matches): 80.00</w:t>
+      </w:r>
     </w:p>
     <w:p>
       <w:pPr>

</xml_diff>